<commit_message>
Expand slide speech text: more detail than on slides, conversational college style
Co-authored-by: arena-agent <297053741+arena-agent@users.noreply.github.com>
</commit_message>
<xml_diff>
--- a/materials/Текст_доклада_по_слайдам.docx
+++ b/materials/Текст_доклада_по_слайдам.docx
@@ -20,7 +20,7 @@
     </w:p>
     <w:p>
       <w:pPr>
-        <w:spacing w:line="276" w:lineRule="auto" w:before="0" w:after="200"/>
+        <w:spacing w:line="276" w:lineRule="auto" w:before="0" w:after="240"/>
         <w:ind w:firstLine="0"/>
         <w:jc w:val="center"/>
       </w:pPr>
@@ -36,6 +36,22 @@
     </w:p>
     <w:p>
       <w:pPr>
+        <w:spacing w:line="276" w:lineRule="auto" w:before="0" w:after="120"/>
+        <w:ind w:firstLine="0"/>
+        <w:jc w:val="both"/>
+      </w:pPr>
+      <w:r>
+        <w:rPr>
+          <w:rFonts w:ascii="Times New Roman" w:hAnsi="Times New Roman" w:eastAsia="Times New Roman"/>
+          <w:b w:val="0"/>
+          <w:i/>
+          <w:sz w:val="26"/>
+        </w:rPr>
+        <w:t>Как пользоваться: это не текст со слайдов, а рассказ к ним — на каждом слайде информации больше, чем написано на экране. Читать дословно не нужно, можно пересказывать своими словами, но цифры и даты лучше оставить как есть.</w:t>
+      </w:r>
+    </w:p>
+    <w:p>
+      <w:pPr>
         <w:spacing w:line="276" w:lineRule="auto" w:before="0" w:after="280"/>
         <w:ind w:firstLine="0"/>
         <w:jc w:val="both"/>
@@ -47,12 +63,12 @@
           <w:i/>
           <w:sz w:val="26"/>
         </w:rPr>
-        <w:t>Что говорить у доски: 2–4 фразы на каждый слайд, примерно 25–30 секунд. Весь доклад — 12–15 минут. Читать дословно не обязательно: текст можно пересказывать своими словами, главное — не уходить в детали таблиц, они есть на экране.</w:t>
+        <w:t>Если регламент короткий (7–10 минут), расскажите только слайды 2, 3, 6, 10, 11, 13, 16, 21, 22, 31, 32 и 33 — остальное можно пропустить или отвечать по ним на вопросы.</w:t>
       </w:r>
     </w:p>
     <w:p>
       <w:pPr>
-        <w:spacing w:before="160" w:after="40" w:line="264" w:lineRule="auto"/>
+        <w:spacing w:before="200" w:after="40" w:line="264" w:lineRule="auto"/>
       </w:pPr>
       <w:r>
         <w:rPr>
@@ -87,12 +103,12 @@
           <w:i w:val="0"/>
           <w:sz w:val="28"/>
         </w:rPr>
-        <w:t>Здравствуйте. Мой доклад о химическом и биологическом оружии — двух видах оружия массового поражения. Расскажу, что это такое, какие бывают виды, чем они опасны, как от них защищаются и что говорит закон.</w:t>
+        <w:t>Здравствуйте, я расскажу про химическое и биологическое оружие. Это два вида оружия массового поражения — то есть оружия, которое за один раз убивает или выводит из строя очень много людей. Сначала объясню, что это вообще такое и чем они друг от друга отличаются, потом покажу историю — от Первой мировой войны до сегодняшнего дня, потом разберу, какими они бывают, как от них защищаются и что об этом говорит закон. В конце будет таблица, где я сравню оба вида.</w:t>
       </w:r>
     </w:p>
     <w:p>
       <w:pPr>
-        <w:spacing w:before="160" w:after="40" w:line="264" w:lineRule="auto"/>
+        <w:spacing w:before="200" w:after="40" w:line="264" w:lineRule="auto"/>
       </w:pPr>
       <w:r>
         <w:rPr>
@@ -127,12 +143,12 @@
           <w:i w:val="0"/>
           <w:sz w:val="28"/>
         </w:rPr>
-        <w:t>Оружие массового поражения бывает трёх видов: ядерное, химическое и биологическое. Ядерное я упомяну только для общей картины, дальше речь пойдёт о двух остальных. Их общая черта: страдают люди, а здания, техника и дороги остаются целыми.</w:t>
+        <w:t>Смотрите, оружие массового поражения бывает трёх видов: ядерное, химическое и биологическое. Ядерное я сегодня не разбираю, оно на слайде просто чтобы было понятно, какое место занимают остальные два. А главное отличие вот в чём: химическое и биологическое оружие не разрушают дома и технику. Ядерный взрыв превращает город в руины, а газ или микробы бьют только по людям — здания, дороги, танки остаются целыми. Именно из-за этого их часто называют оружием бедных и оружием террористов: сделать их проще и дешевле, чем содержать современную армию.</w:t>
       </w:r>
     </w:p>
     <w:p>
       <w:pPr>
-        <w:spacing w:before="160" w:after="40" w:line="264" w:lineRule="auto"/>
+        <w:spacing w:before="200" w:after="40" w:line="264" w:lineRule="auto"/>
       </w:pPr>
       <w:r>
         <w:rPr>
@@ -167,12 +183,12 @@
           <w:i w:val="0"/>
           <w:sz w:val="28"/>
         </w:rPr>
-        <w:t>Химическое оружие — это ядовитые вещества и то, чем их распыляют: снаряды, бомбы, баллоны. Применяется оно так: туман или газ, капли и масляные пятна, люди массово задыхаются — а техника при этом не повреждена. За одну только Первую мировую войну отравляющими веществами были поражены около 1,3 миллиона человек.</w:t>
+        <w:t>Химическое оружие — это, по сути, ядовитые химические вещества плюс то, чем их распыляют. Снаряд, авиабомба, баллон или распылитель на дроне — неважно; важно, что внутри яд. На фотографии — ирано-иракская война 1980-х, там солдаты в противогазах, потому что без них на такой войне просто не выжить. Выглядит применение так: появляется туман или дым непонятного цвета, на земле остаются масляные пятна, и люди начинают массово кашлять, задыхаться, тереть глаза. При этом техника не повреждена вообще — танк стоит целый, а экипаж погиб. Для понимания масштаба: только за Первую мировую войну отравляющими веществами поразили около 1,3 миллиона человек.</w:t>
       </w:r>
     </w:p>
     <w:p>
       <w:pPr>
-        <w:spacing w:before="160" w:after="40" w:line="264" w:lineRule="auto"/>
+        <w:spacing w:before="200" w:after="40" w:line="264" w:lineRule="auto"/>
       </w:pPr>
       <w:r>
         <w:rPr>
@@ -207,12 +223,12 @@
           <w:i w:val="0"/>
           <w:sz w:val="28"/>
         </w:rPr>
-        <w:t>Яд попадает в организм четырьмя путями. Через дыхание — самый быстрый. Через кожу — так действуют иприт и VX. Через воду и еду. И через раны. Поэтому защиты две: противогаз закрывает дыхание, а защитный костюм — кожу.</w:t>
+        <w:t>Яду нужно как-то попасть в организм, и путей всего четыре. Первый и самый быстрый — через дыхание: вдохнул, и яд через лёгкие сразу в крови. Второй — через кожу: достаточно капли на руке; так работают иприт и VX. Третий — с водой и едой, это особенно опасно на захваченной территории. И четвёртый — через открытую рану, там яд идёт прямо в кровь. Отсюда практический вывод, который нам в БЖ как раз и нужен: защита должна быть двойная. Противогаз закрывает дыхание, защитный костюм закрывает кожу. Говорить о чём-то одном бессмысленно: от иприта противогаз спасает только лёгкие, но не руки.</w:t>
       </w:r>
     </w:p>
     <w:p>
       <w:pPr>
-        <w:spacing w:before="160" w:after="40" w:line="264" w:lineRule="auto"/>
+        <w:spacing w:before="200" w:after="40" w:line="264" w:lineRule="auto"/>
       </w:pPr>
       <w:r>
         <w:rPr>
@@ -247,12 +263,12 @@
           <w:i w:val="0"/>
           <w:sz w:val="28"/>
         </w:rPr>
-        <w:t>Несколько фактов. Зарин назван по первым буквам фамилий четырёх химиков, которые его открыли. Иприт получил имя по городу Ипр, где его впервые применили. VX изначально исследовали как средство от насекомых. «Эйджент Оранж» назван просто по цвету полосы на бочках. А во Франции до сих пор находят химические снаряды Первой мировой.</w:t>
+        <w:t>Несколько фактов, они хорошо запоминаются. Зарин назван не просто так: его открыли в Германии в 1938 году, и в название вошли первые буквы фамилий четырёх химиков, которые над ним работали. Иприт получил имя по бельгийскому городу Ипр, где его впервые применили. VX — это яд, которого хватает буквально несколько капель, и изначально его исследовали как средство от насекомых, а совсем не как оружие. «Эйджент Оранж» назвали вообще смешно — просто потому, что на бочках была оранжевая полоса. И ещё деталь: французские крестьяне до сих пор, спустя больше ста лет, находят на своих полях неразорвавшиеся химические снаряды Первой мировой — их выкапывают и обезвреживают до сих пор, каждый год тоннами.</w:t>
       </w:r>
     </w:p>
     <w:p>
       <w:pPr>
-        <w:spacing w:before="160" w:after="40" w:line="264" w:lineRule="auto"/>
+        <w:spacing w:before="200" w:after="40" w:line="264" w:lineRule="auto"/>
       </w:pPr>
       <w:r>
         <w:rPr>
@@ -287,12 +303,12 @@
           <w:i w:val="0"/>
           <w:sz w:val="28"/>
         </w:rPr>
-        <w:t>22 апреля 1915 года под бельгийским городом Ипр немцы выпустили около 168 тонн хлора из 5730 баллонов. Жёлто-зелёное облако высотой до 12 метров пошло на окопы, защиты у солдат не было, и в обороне образовалась брешь в несколько километров.</w:t>
+        <w:t>22 апреля 1915 года, Бельгия, город Ипр. Немцы установили 5730 баллонов и выпустили около 168 тонн хлора. Представьте картину: жёлто-зелёное облако высотой до 12 метров и шириной в несколько километров медленно идёт по ветру на французские окопы. Защиты тогда не было вообще никакой — солдаты закрывали лицо тряпками, кто-то мочил их водой, потому что слышали, что влажная ткань помогает. В результате в обороне образовалась брешь в несколько километров. Любопытно, что сами немцы не ожидали такого эффекта и не подготовили резерв для прорыва — они просто не поверили, что получится настолько сильно.</w:t>
       </w:r>
     </w:p>
     <w:p>
       <w:pPr>
-        <w:spacing w:before="160" w:after="40" w:line="264" w:lineRule="auto"/>
+        <w:spacing w:before="200" w:after="40" w:line="264" w:lineRule="auto"/>
       </w:pPr>
       <w:r>
         <w:rPr>
@@ -327,12 +343,12 @@
           <w:i w:val="0"/>
           <w:sz w:val="28"/>
         </w:rPr>
-        <w:t>В 1917 году появляется иприт — яд, который действует через кожу, и одного противогаза становится мало. Ответом России стал противогаз Зелинского 1915 года с активированным углём. С этого момента защита стала двойной — дыхание плюс кожа, — и появились войска химической защиты.</w:t>
+        <w:t>Дальше начинается гонка: одна сторона придумывает яд, другая — защиту. В 1917 году появляется иприт, и он коварен другим: действует не сразу. Человек может вообще ничего не почувствовать, а через несколько часов кожа покрывается пузырями и язвами, поражаются глаза и лёгкие. То есть противогаз закрывает дыхание, а яд всё равно проходит через кожу и одежду. Ответ России появился даже раньше — в 1915 году химик Николай Зелинский создал угольный противогаз: внутри активированный уголь, он работает как губка и впитывает ядовитые вещества. Его массово начали выдавать армии, и это спасло очень много жизней. С этого момента стало ясно, что защита должна быть двойной — дыхание плюс кожа, — так и появились войска химической защиты, сейчас это войска РХБЗ.</w:t>
       </w:r>
     </w:p>
     <w:p>
       <w:pPr>
-        <w:spacing w:before="160" w:after="40" w:line="264" w:lineRule="auto"/>
+        <w:spacing w:before="200" w:after="40" w:line="264" w:lineRule="auto"/>
       </w:pPr>
       <w:r>
         <w:rPr>
@@ -367,12 +383,12 @@
           <w:i w:val="0"/>
           <w:sz w:val="28"/>
         </w:rPr>
-        <w:t>В таблице главное вот что: Женевский протокол 1925 года запретил применение газов, но не запретил их производить и хранить, и проверять исполнение было некому. Поэтому после него были и Эфиопия, и лагеря смерти, и Вьетнам, и война Ирана с Ираком. Вывод простой: запрет без проверки не работает.</w:t>
+        <w:t>Тут на слайде таблица, но я скажу только главное. В 1925 году приняли Женевский протокол: применять газы на войне запретили. Звучит правильно, но в нём была огромная дыра — запретили применять, а производить и хранить нет. И проверять, кто что делает, было некому, никаких инспекций не существовало. В итоге уже после этого запрета Италия травила Эфиопию ипритом с самолётов, нацисты использовали инсектицид «Циклон-Б» в лагерях смерти, США лили дефолианты во Вьетнаме, а Ирак применял газы против Ирана и против собственных курдов. Вывод, который нам важнее всего: запрет на бумаге без проверки не работает. Поэтому позже и появились отдельные конвенции — КБТО в 1972 году и КЗХО в 1993-м.</w:t>
       </w:r>
     </w:p>
     <w:p>
       <w:pPr>
-        <w:spacing w:before="160" w:after="40" w:line="264" w:lineRule="auto"/>
+        <w:spacing w:before="200" w:after="40" w:line="264" w:lineRule="auto"/>
       </w:pPr>
       <w:r>
         <w:rPr>
@@ -407,12 +423,12 @@
           <w:i w:val="0"/>
           <w:sz w:val="28"/>
         </w:rPr>
-        <w:t>В марте 1988 года Ирак нанёс химический удар по курдскому городу Халабджа. Погибли от 3 до 5 тысяч человек, пострадали больше 10 тысяч — в основном мирные жители. Болезни и врождённые пороки у детей остались у людей на десятилетия.</w:t>
+        <w:t>Самая известная химическая атака по мирным — Халабджа, март 1988 года. Иракская авиация ударила по курдскому городу: применили иприт, зарин и другие вещества. Погибли, по разным оценкам, от трёх до пяти тысяч человек, пострадали больше десяти тысяч, и это почти сплошь мирные жители — женщины, старики, дети. Смысл в том, что люди умирали прямо в домах и на улицах, причём многие уже после того, как самолёты ушли, — они просто не знали, что произошло и что делать. А последствия остались на десятилетия: у выживших хронические болезни лёгких и глаз, и у детей, родившихся потом, часто врождённые пороки.</w:t>
       </w:r>
     </w:p>
     <w:p>
       <w:pPr>
-        <w:spacing w:before="160" w:after="40" w:line="264" w:lineRule="auto"/>
+        <w:spacing w:before="200" w:after="40" w:line="264" w:lineRule="auto"/>
       </w:pPr>
       <w:r>
         <w:rPr>
@@ -447,12 +463,12 @@
           <w:i w:val="0"/>
           <w:sz w:val="28"/>
         </w:rPr>
-        <w:t>20 марта 1995 года секта Аум Синрикё, запрещённая в России, пустила зарин в токийское метро в час пик: пакеты с жидкостью просто проткнули зонтиками. Погибли 13–14 человек, более 6 тысяч обратились за помощью. Это был первый случай, когда химическое оружие применили не военные, а террористы.</w:t>
+        <w:t>А вот случай, после которого отношение к теме изменилось. Токио, 20 марта 1995 года. Религиозная секта Аум Синрикё, у нас она запрещена, взяла обычные пакеты с жидким зарином, спустилась в метро в час пик, проткнула пакеты зонтиками и спокойно вышла. Погибли 13–14 человек, больше шести тысяч обратились за помощью, станции закрыли, город охватила паника. Почему это важно: до этого химическое оружие считалось делом армий и государств, а тут выяснилось, что группе фанатиков с лабораторией хватает пакетов и зонтика. С этого времени химическую угрозу считают прежде всего террористической. Кстати, они же пытались распылять сибирскую язву и ботулотоксин, но не справились с техникой — поэтому и выбрали зарин.</w:t>
       </w:r>
     </w:p>
     <w:p>
       <w:pPr>
-        <w:spacing w:before="160" w:after="40" w:line="264" w:lineRule="auto"/>
+        <w:spacing w:before="200" w:after="40" w:line="264" w:lineRule="auto"/>
       </w:pPr>
       <w:r>
         <w:rPr>
@@ -487,12 +503,12 @@
           <w:i w:val="0"/>
           <w:sz w:val="28"/>
         </w:rPr>
-        <w:t>Коротко по таблице. Сирия, 2013 год — зарин. Солсбери, 2018 и Навальный, 2020 — семейство ядов «Новичок». Украина, 2024–2025 годы — эксперты ОЗХО подтвердили применение газа CS. Сирия, 2025–2026 — инспекторы находят незаявленные боеприпасы. Вывод: оружие применяют до сих пор.</w:t>
+        <w:t>Теперь современность, и тут важно, что оружие применяют до сих пор. Сирия, 2013 год — зарин по пригородам Дамаска; оценки жертв очень разные, от нескольких сотен до больше тысячи человек, но это крупнейшая химическая атака XXI века. Солсбери, 2018 год — отравление Сергея Скрипаля веществом семейства «Новичок», это ещё советская разработка, и ОЗХО подтвердила тип вещества. В 2020 году тем же семейством отравили Алексея Навального. По Украине: три доклада экспертов ОЗХО за 2024–2025 годы подтвердили, что на линии соприкосновения в боеприпасах и в пробах грунта был газ CS — это газ для разгона демонстраций, применять его как оружие войны запрещено. И Сирия: после смены власти в декабре 2024 года инспекторы ОЗХО продолжают находить незаявленные боеприпасы и химикаты. То есть даже когда страна вроде бы всё сдала, что-то остаётся.</w:t>
       </w:r>
     </w:p>
     <w:p>
       <w:pPr>
-        <w:spacing w:before="160" w:after="40" w:line="264" w:lineRule="auto"/>
+        <w:spacing w:before="200" w:after="40" w:line="264" w:lineRule="auto"/>
       </w:pPr>
       <w:r>
         <w:rPr>
@@ -527,12 +543,12 @@
           <w:i w:val="0"/>
           <w:sz w:val="28"/>
         </w:rPr>
-        <w:t>Основных групп отравляющих веществ шесть, и название каждой подсказывает, куда она бьёт: нервно-паралитические — по нервам, удушающие — по лёгким, кожно-нарывные — по коже. Дальше я разберу их отдельно.</w:t>
+        <w:t>Дальше разбор по видам. Отравляющих веществ выделяют шесть групп, и называются они по тому, на что бьют: нервно-паралитические — по нервной системе, удушающие — по лёгким, кожно-нарывные — по коже, общеядовитые — по всему организму, раздражающие — по глазам и горлу, психохимические — по сознанию. В таблице на слайде даны примеры каждой группы: зарин, иприт, хлор, синильная кислота, CS и BZ. Дальше я пройдусь по самым важным из них.</w:t>
       </w:r>
     </w:p>
     <w:p>
       <w:pPr>
-        <w:spacing w:before="160" w:after="40" w:line="264" w:lineRule="auto"/>
+        <w:spacing w:before="200" w:after="40" w:line="264" w:lineRule="auto"/>
       </w:pPr>
       <w:r>
         <w:rPr>
@@ -567,12 +583,12 @@
           <w:i w:val="0"/>
           <w:sz w:val="28"/>
         </w:rPr>
-        <w:t>Это самая опасная группа: зарин, зоман, VX и «Новичок». Признаки — узкие зрачки, слюни и слёзы, тяжело дышать, судороги, потеря сознания. Помощь: противогаз, немедленно ввести противоядие — атропин — и срочно к врачу.</w:t>
+        <w:t>Нервно-паралитические — самые опасные: зарин, зоман, VX и «Новичок». Работают они примерно так: в нервной системе всё передаётся химическими сигналами, а эти вещества сигналы ломают — мышцы перестают слушаться, и человек не может дышать. Признаки узнаваемые: зрачки сужаются, зрения будто не хватает, текут слюни и слёзы, тяжело дышать, потом судороги и потеря сознания. Смерть, грубо говоря, наступает от удушья. Помощь: противогаз и немедленно противоядие — атропин, он есть в армейской аптечке в шприц-тюбике. Счёт идёт на минуты. На фотографии — Солсбери, март 2018 года: специалисты работают на месте отравления «Новичком».</w:t>
       </w:r>
     </w:p>
     <w:p>
       <w:pPr>
-        <w:spacing w:before="160" w:after="40" w:line="264" w:lineRule="auto"/>
+        <w:spacing w:before="200" w:after="40" w:line="264" w:lineRule="auto"/>
       </w:pPr>
       <w:r>
         <w:rPr>
@@ -607,12 +623,12 @@
           <w:i w:val="0"/>
           <w:sz w:val="28"/>
         </w:rPr>
-        <w:t>Иприт обжигает кожу, глаза и лёгкие, причём не сразу: покраснение и пузыри появляются через несколько часов, когда человек уже ничего не чувствует. Хлор и фосген разъедают дыхательные пути и вызывают отёк лёгких. Интересный факт: хлор используют на каждой водопроводной станции — у боевых ядов почти всегда есть мирное применение.</w:t>
+        <w:t>Иприт — кожно-нарывной, он обжигает кожу, глаза и лёгкие. Его главная хитрость в том, что он действует не сразу: попадание капли человек может вообще не почувствовать, а через несколько часов появляются покраснение, зуд, пузыри и язвы. Поэтому при иприте решающее значение имеет скорость обработки кожи — ждать симптомов нельзя. Справа на слайде — удушающие, хлор и фосген: они разъедают дыхательные пути и вызывают отёк лёгких, человек фактически задыхается. И интересная деталь про хлор: это тот самый газ, которым обеззараживают воду на каждой водопроводной станции. То есть почти у любого боевого яда есть мирное применение — поэтому запрещают не сами вещества, а именно оружие на их основе.</w:t>
       </w:r>
     </w:p>
     <w:p>
       <w:pPr>
-        <w:spacing w:before="160" w:after="40" w:line="264" w:lineRule="auto"/>
+        <w:spacing w:before="200" w:after="40" w:line="264" w:lineRule="auto"/>
       </w:pPr>
       <w:r>
         <w:rPr>
@@ -647,12 +663,12 @@
           <w:i w:val="0"/>
           <w:sz w:val="28"/>
         </w:rPr>
-        <w:t>Общеядовитые — синильная кислота и угарный газ: кровь перестаёт переносить кислород, человек задыхается изнутри. Раздражающие — это CS, газ для разгона демонстраций; применять его как оружие войны запрещено. Психохимические, например BZ, вызывают галлюцинации. Помощь при любом из них одна: противогаз, чистый воздух, промыть кожу и глаза, вызвать врачей.</w:t>
+        <w:t>Остальные три группы — коротко. Общеядовитые: синильная кислота и угарный газ. Они делают так, что кровь перестаёт переносить кислород, и человек задыхается как бы изнутри — смерть может наступить за минуты. Есть известная байка про запах горького миндаля, но есть важная деталь: примерно треть людей этот запах не чувствуют вообще, так что ориентироваться на него нельзя. Раздражающие — это CS и CN, тот самый газ, которым разгоняют демонстрации: жжёт глаза и горло, слёзы текут, но, как правило, не убивает; при этом КЗХО прямо запрещает использовать его как оружие войны. Психохимические, вроде BZ, бьют по сознанию: галлюцинации, дезориентация, человек временно небоеспособен. Помощь при всём этом общая: противогаз, чистый воздух, снять одежду, промыть кожу и глаза, врач.</w:t>
       </w:r>
     </w:p>
     <w:p>
       <w:pPr>
-        <w:spacing w:before="160" w:after="40" w:line="264" w:lineRule="auto"/>
+        <w:spacing w:before="200" w:after="40" w:line="264" w:lineRule="auto"/>
       </w:pPr>
       <w:r>
         <w:rPr>
@@ -687,12 +703,12 @@
           <w:i w:val="0"/>
           <w:sz w:val="28"/>
         </w:rPr>
-        <w:t>Признаки применения: необычный запах или туман, масляные пятна на земле, много людей с одинаковыми симптомами, погибшие насекомые. Действия: надеть противогаз или влажную повязку, выйти из зоны поперёк ветра, укрыться и вызвать службу спасения. И помните: яд тяжелее воздуха и стекает вниз — в подвалы и низины.</w:t>
+        <w:t>Теперь самое полезное для нас: как понять, что это случилось, и что делать. Признаки: незнакомый запах, туман или дым без видимой причины; масляные пятна и капли на асфальте и технике; много людей вокруг с одинаковыми симптомами — кашляют, задыхаются, трут глаза; погибшие насекомые и птицы, поникшая трава. Если вы это увидели, порядок такой: закрыть лицо влажной тканью или надеть противогаз; уходить не по ветру, а поперёк, чтобы быстрее выйти из облака; не садиться на землю и не трогать ничего руками; укрыться в помещении, закрыть окна и двери; позвонить в службу спасения и дальше слушать, что говорят. И правило из физики: пары этих веществ тяжелее воздуха, они стекают вниз — в подвалы, траншеи, низины. Поэтому укрытие лучше искать повыше, а не спускаться в подвал.</w:t>
       </w:r>
     </w:p>
     <w:p>
       <w:pPr>
-        <w:spacing w:before="160" w:after="40" w:line="264" w:lineRule="auto"/>
+        <w:spacing w:before="200" w:after="40" w:line="264" w:lineRule="auto"/>
       </w:pPr>
       <w:r>
         <w:rPr>
@@ -727,12 +743,12 @@
           <w:i w:val="0"/>
           <w:sz w:val="28"/>
         </w:rPr>
-        <w:t>Защита трёх уровней. Индивидуальная — противогаз и защитный костюм. Коллективная — герметичные убежища и техника с фильтрами воздуха. И обеззараживание: специальные растворы смывают и обезвреживают яд с техники, земли и одежды.</w:t>
+        <w:t>Защита от химического оружия трёх видов. Первая, индивидуальная: противогаз — он закрывает глаза, лицо и дыхание, и защитный костюм, у нас он называется ОЗК, плюс перчатки и сапоги. Вместе они дают полную защиту, по отдельности — нет. Вторая, коллективная: герметичные убежища и техника, в которых воздух проходит через фильтры, — внутри можно нормально дышать. И третья — обеззараживание: специальные растворы, которыми обрабатывают технику, одежду и землю, нейтрализуя яд; людей при этом пропускают через санитарную обработку. Всей этой работой занимаются войска РХБЗ, на фотографии как раз их учения.</w:t>
       </w:r>
     </w:p>
     <w:p>
       <w:pPr>
-        <w:spacing w:before="160" w:after="40" w:line="264" w:lineRule="auto"/>
+        <w:spacing w:before="200" w:after="40" w:line="264" w:lineRule="auto"/>
       </w:pPr>
       <w:r>
         <w:rPr>
@@ -767,12 +783,12 @@
           <w:i w:val="0"/>
           <w:sz w:val="28"/>
         </w:rPr>
-        <w:t>Пять шагов первой помощи. Первый и главный: защитись сам, иначе пострадавших станет двое. Дальше — выведи человека на чистый воздух, сними заражённую одежду, промой кожу и глаза, введи противоядие из аптечки и вызови врачей. Счёт идёт на минуты.</w:t>
+        <w:t>Первая помощь — пять шагов, и первый самый важный: сначала защитись сам. Если ты спохватишься надеть противогаз уже после того, как вдохнул, помогать будет некому, и пострадавших станет двое. Дальше вывести человека на чистый воздух, уходя поперёк ветра. Третье — снять заражённую одежду и промыть кожу и глаза водой с мылом; важная деталь: если это иприт, капли сначала промокают тампоном, а не размазывают по коже. Четвёртое — ввести противоядие: при нервно-паралитических веществах это атропин из аптечки. И пятое — вызвать врачей и нормально описать симптомы. Главное: работает то, что сделано в первые пять-десять минут, потом шансы падают.</w:t>
       </w:r>
     </w:p>
     <w:p>
       <w:pPr>
-        <w:spacing w:before="160" w:after="40" w:line="264" w:lineRule="auto"/>
+        <w:spacing w:before="200" w:after="40" w:line="264" w:lineRule="auto"/>
       </w:pPr>
       <w:r>
         <w:rPr>
@@ -807,12 +823,12 @@
           <w:i w:val="0"/>
           <w:sz w:val="28"/>
         </w:rPr>
-        <w:t>Конвенция 1993 года запрещает производить, хранить и применять химическое оружие; в ней участвуют 193 государства. За исполнением следит ОЗХО — организация в Гааге с правом инспекций; в 2013 году она получила Нобелевскую премию мира.</w:t>
+        <w:t>Кто всё это запрещает. В 1993 году приняли Конвенцию о запрещении химического оружия — КЗХО. Она запрещает не только применять, но и разрабатывать, производить, накапливать и передавать — то есть весь цикл. Участников 193 государства, это практически все страны мира. За исполнением следит ОЗХО — организация в Гааге, и у неё есть реальные инспекторы, которые приезжают на объекты. В 2013 году ОЗХО получила Нобелевскую премию мира. Не участвуют, кстати, всего несколько стран: Египет, Северная Корея, Южный Судан; Израиль конвенцию подписал, но не ратифицировал. Вот эти несколько стран — отдельная головная боль для всех остальных.</w:t>
       </w:r>
     </w:p>
     <w:p>
       <w:pPr>
-        <w:spacing w:before="160" w:after="40" w:line="264" w:lineRule="auto"/>
+        <w:spacing w:before="200" w:after="40" w:line="264" w:lineRule="auto"/>
       </w:pPr>
       <w:r>
         <w:rPr>
@@ -847,12 +863,12 @@
           <w:i w:val="0"/>
           <w:sz w:val="28"/>
         </w:rPr>
-        <w:t>Боеприпасы разбирают в герметичных камерах, а яд обезвреживают химической реакцией или сжигают при очень высокой температуре — всё под контролем инспекторов. Россия уничтожила свои запасы в 2017 году, это около 40 тысяч тонн; США — в июле 2023-го. Всего уничтожено 72 304 тонны.</w:t>
+        <w:t>Как уничтожают. Боеприпасы разбирают в герметичных камерах, а сам яд либо обезвреживают химической реакцией, либо сжигают при очень высокой температуре; всё это идёт под камерами и под присмотром инспекторов. Россия уничтожила свои запасы 27 сентября 2017 года — это около сорока тысяч тонн, самая крупная программа в мире. США закончили в июле 2023 года на объекте Блю Грасс в Кентукки, там уничтожили самую последнюю объявленную единицу. Часть сирийского оружия в 2013–2014 годах вывезли и нейтрализовали прямо на судне в море. Итог: с 1997 года уничтожено 72 304 тонны, и это первая категория оружия массового поражения, которую человечество ликвидировало полностью — правда, только из официально заявленных запасов.</w:t>
       </w:r>
     </w:p>
     <w:p>
       <w:pPr>
-        <w:spacing w:before="160" w:after="40" w:line="264" w:lineRule="auto"/>
+        <w:spacing w:before="200" w:after="40" w:line="264" w:lineRule="auto"/>
       </w:pPr>
       <w:r>
         <w:rPr>
@@ -887,12 +903,12 @@
           <w:i w:val="0"/>
           <w:sz w:val="28"/>
         </w:rPr>
-        <w:t>Биологическое оружие — это болезнетворные микробы или их яды, которые распространяют специально. Доставляют их распылителями, через воду и еду, насекомыми или даже в письмах. Его называют «атомной бомбой бедняка»: поразить большую площадь им стоит очень дёшево.</w:t>
+        <w:t>Теперь биологическое оружие. Это болезнетворные микробы — бактерии, вирусы — или их яды, которые распространяют специально, чтобы вызвать болезнь и смерть. Доставляют по-разному: распылители с самолётов и дронов, заражённые вода и еда, заражённые насекомые — блохи, комары, клещи, — и даже письма. На фотографии — споры сибирской язвы под микроскопом; они, кстати, сохраняются в почве десятилетиями. И вот цифра, из-за которую это оружие называют «атомной бомбой бедняка»: по расчётам экспертов, поразить один квадратный километр территории микробами стоит в сотни раз дешевле, чем обычным или ядерным оружием.</w:t>
       </w:r>
     </w:p>
     <w:p>
       <w:pPr>
-        <w:spacing w:before="160" w:after="40" w:line="264" w:lineRule="auto"/>
+        <w:spacing w:before="200" w:after="40" w:line="264" w:lineRule="auto"/>
       </w:pPr>
       <w:r>
         <w:rPr>
@@ -927,12 +943,12 @@
           <w:i w:val="0"/>
           <w:sz w:val="28"/>
         </w:rPr>
-        <w:t>Пять отличий от химического. Действует не сразу — от нескольких часов до трёх недель. Передаётся от человека к человеку. Микроб живой и размножается. Заметить применение почти невозможно. И масштаб может дойти до целого континента.</w:t>
+        <w:t>Чем оно отличается от химического — пять пунктов. Первое: действует не сразу. Химическое — секунды и минуты, а здесь инкубационный период: от нескольких часов до двух-трёх недель. За это время человек успевает уехать, пообщаться с десятками людей и уехать ещё дальше. Второе: оно заразно, передаётся от человека к человеку. Третье: микроб живой и размножается, то есть эпидемия живёт своей жизнью и совершенно не подчиняется тому, кто её начал. Четвёртое: заметить невозможно — ни взрыва, ни облака, ни запаха. И пятое: масштаб может дойти до целого континента. Вот поэтому биологическое оружие считают более опасным, чем химическое.</w:t>
       </w:r>
     </w:p>
     <w:p>
       <w:pPr>
-        <w:spacing w:before="160" w:after="40" w:line="264" w:lineRule="auto"/>
+        <w:spacing w:before="200" w:after="40" w:line="264" w:lineRule="auto"/>
       </w:pPr>
       <w:r>
         <w:rPr>
@@ -967,12 +983,12 @@
           <w:i w:val="0"/>
           <w:sz w:val="28"/>
         </w:rPr>
-        <w:t>История древнее, чем кажется. В 1346 году при осаде Каффы через стены забрасывали трупы умерших от чумы. В 1763 году индейцам передали одеяла из оспенного госпиталя. И факт: оспа — единственная болезнь, которую человечество победило полностью, в 1980 году.</w:t>
+        <w:t>История у него даже древнее, чем у химического. 1346 год, осада крепости Каффа в Крыму: осаждавшие забрасывали через стены трупы людей, умерших от чумы, и в городе началась эпидемия. 1763 год, Северная Америка: британские офицеры передали индейцам одеяла и платки из оспенного госпиталя. И важный факт про оспу: это единственная болезнь, которую человечество победило полностью — в 1980 году ВОЗ объявила о её ликвидации. Но сам вирус никуда не делся: он хранится ровно в двух лабораториях — в России и в США, — и это, по сути, главный риск случайной утечки, о котором говорят специалисты.</w:t>
       </w:r>
     </w:p>
     <w:p>
       <w:pPr>
-        <w:spacing w:before="160" w:after="40" w:line="264" w:lineRule="auto"/>
+        <w:spacing w:before="200" w:after="40" w:line="264" w:lineRule="auto"/>
       </w:pPr>
       <w:r>
         <w:rPr>
@@ -1007,12 +1023,12 @@
           <w:i w:val="0"/>
           <w:sz w:val="28"/>
         </w:rPr>
-        <w:t>Японский отряд 731 заражал людей чумой и холерой — погибли десятки тысяч. В 1979 году в Свердловске из военной лаборатории выбросило споры сибирской язвы: погибли не менее 64 человек, а власти объясняли это заражённым мясом. Споры сибирской язвы сохраняются в почве десятилетиями.</w:t>
+        <w:t>Два примера двадцатого века. Первый — японский отряд 731 в Маньчжурии: там заражали людей чумой, холерой и сибирской язвой, испытывали бомбы с блохами, погибли десятки тысяч человек; это самые страшные страницы темы. Второй, уже наш, — авария в Свердловске в 1979 году: из военной лаборатории выбросило облако спор сибирской язвы, погибли не менее 64 человек. Власти тогда объясняли вспышку заражённым мясом и скрывали правду годами, официально признали только в 90-х. И деталь про стойкость: споры сибирской язвы живут в почве десятилетиями; шотландский остров Грюнард, где в 1942 году испытывали бомбу с сибирской язвой, был закрыт почти 50 лет.</w:t>
       </w:r>
     </w:p>
     <w:p>
       <w:pPr>
-        <w:spacing w:before="160" w:after="40" w:line="264" w:lineRule="auto"/>
+        <w:spacing w:before="200" w:after="40" w:line="264" w:lineRule="auto"/>
       </w:pPr>
       <w:r>
         <w:rPr>
@@ -1047,12 +1063,12 @@
           <w:i w:val="0"/>
           <w:sz w:val="28"/>
         </w:rPr>
-        <w:t>Секта Аум Синрикё пыталась распылить сибирскую язву и ботулотоксин, но не справилась с технологией — поэтому выбрала зарин. В 2001 году в США разослали письма со спорами: 22 человека заболели, 5 погибли, почту и Сенат закрывали на месяцы. Для биологической атаки иногда хватает одного конверта и марки.</w:t>
+        <w:t>Что происходит сейчас. Секта Аум Синрикё пыталась распылять сибирскую язву и ботулотоксин в Токио, но не справилась с техникой — это оказалось сложнее, чем разлить зарин, поэтому они и ушли в химию. Самый показательный случай — письма в США осенью 2001 года: несколько конвертов с белым порошком, 22 человека заболели, пятеро погибли, а почтовые отделения и здания Сената закрывали на месяцы; очистка помещений обошлась в сотни миллионов долларов. Был ещё конверт с рицином в 2013 году — там никто не пострадал, но переполох был серьёзный. Вывод: для биологической атаки не нужна армия, иногда хватает одного конверта и почтовой марки.</w:t>
       </w:r>
     </w:p>
     <w:p>
       <w:pPr>
-        <w:spacing w:before="160" w:after="40" w:line="264" w:lineRule="auto"/>
+        <w:spacing w:before="200" w:after="40" w:line="264" w:lineRule="auto"/>
       </w:pPr>
       <w:r>
         <w:rPr>
@@ -1087,12 +1103,12 @@
           <w:i w:val="0"/>
           <w:sz w:val="28"/>
         </w:rPr>
-        <w:t>Четыре группы. Бактерии — сибирская язва, чума, холера; лечатся антибиотиками. Вирусы — оспа, Эбола; антибиотики на них не действуют. Риккетсии — сыпной тиф, переносят вши и клещи. Токсины — это уже яды, они не заразны, но очень сильные: ботулотоксин и рицин.</w:t>
+        <w:t>Четыре группы агентов. Бактерии — это живые клетки: сибирская язва, чума, холера, туляремия; их лечат антибиотиками. Вирусы — оспа, Эбола, Марбург, жёлтая лихорадка; они во много раз мельче бактерий, живут только внутри клеток, и антибиотики на них не действуют вообще. Риккетсии — что-то среднее между первыми двумя: сыпной тиф, Ку-лихорадка, переносят их вши, блохи и клещи. И токсины — это уже не живые организмы, а яды: ботулотоксин, рицин, стафилококковый энтеротоксин. Они не заразны, зато очень сильны. Факт: ботулотоксин — самый сильный яд из известных науке. Но в ничтожных дозах он лечит: из него сделали знаменитый ботокс, которым разглаживают морщины и лечат спазмы мышц.</w:t>
       </w:r>
     </w:p>
     <w:p>
       <w:pPr>
-        <w:spacing w:before="160" w:after="40" w:line="264" w:lineRule="auto"/>
+        <w:spacing w:before="200" w:after="40" w:line="264" w:lineRule="auto"/>
       </w:pPr>
       <w:r>
         <w:rPr>
@@ -1127,12 +1143,12 @@
           <w:i w:val="0"/>
           <w:sz w:val="28"/>
         </w:rPr>
-        <w:t>Категория А — самое опасное: сибирская язва, оспа, чума. Категория B — среднее: бруцеллёз, рицин. Категория C — то, что может появиться в будущем. По этим категориям планируют, какие вакцины и лекарства держать в запасе.</w:t>
+        <w:t>Категории опасности. Категория А — самое страшное: сибирская язва, оспа, чума, туляремия, ботулизм, геморрагические лихорадки; они легко передаются и дают высокую смертность, к ним готовятся в первую очередь. Категория B — среднее: бруцеллёз, сап, Ку-лихорадка, рицин, стафилококковый энтеротоксин — распространяются труднее, лечатся успешнее. Категория C — это того, чего пока нет, но что может появиться: вирусы Нипах, хантавирусы, бактерии, устойчивые к лекарствам. Эту систему использует американский центр по контролю заболеваний, CDC, и по ней планируют, какие вакцины и лекарства держать в запасе.</w:t>
       </w:r>
     </w:p>
     <w:p>
       <w:pPr>
-        <w:spacing w:before="160" w:after="40" w:line="264" w:lineRule="auto"/>
+        <w:spacing w:before="200" w:after="40" w:line="264" w:lineRule="auto"/>
       </w:pPr>
       <w:r>
         <w:rPr>
@@ -1167,12 +1183,12 @@
           <w:i w:val="0"/>
           <w:sz w:val="28"/>
         </w:rPr>
-        <w:t>Защита строится на прививках, гигиене и чистой воде. Если угроза уже есть — маски, дезинфекция, защита от насекомых и грызунов. И разница, которую часто спрашивают: карантин — это полная изоляция очага с охраной, а обсервация мягче, людей просто наблюдают у врачей.</w:t>
+        <w:t>Защита от биологического оружия — это по сути эпидемиология, а не противогаз. До угрозы — прививки: от сибирской язвы, оспы, чумы; плюс обычная гигиена, чистая вода и защита продуктов. Если угроза уже объявлена — маски и респираторы, проветривание и влажная уборка, дезинфекция помещений, борьба с насекомыми и грызунами. И два слова, которые часто путают. Карантин — это полная изоляция очага, с охраной, въезд и выезд запрещены вообще. Обсервация мягче: людей не запирают, а наблюдают — измеряют температуру, осматривают врачи, но жить и передвигаться можно. На фотографии — лаборатория максимального уровня биобезопасности, там работают в скафандре с избыточным давлением.</w:t>
       </w:r>
     </w:p>
     <w:p>
       <w:pPr>
-        <w:spacing w:before="160" w:after="40" w:line="264" w:lineRule="auto"/>
+        <w:spacing w:before="200" w:after="40" w:line="264" w:lineRule="auto"/>
       </w:pPr>
       <w:r>
         <w:rPr>
@@ -1207,12 +1223,12 @@
           <w:i w:val="0"/>
           <w:sz w:val="28"/>
         </w:rPr>
-        <w:t>Факты: споры сибирской язвы живут в почве десятки лет; рицин получают из касторовых бобов; чуму разносят блохи, а сыпной тиф — вши. И ещё: оспа побеждена, но образцы вируса до сих пор хранятся в двух лабораториях — в России и в США.</w:t>
+        <w:t>Факты. Споры сибирской язвы сохраняются в почве десятки лет: микроб как будто засыпает и ждёт. Рицин получают из касторовых бобов — из тех самых, из которых делают касторовое масло. Чуму разносят блохи, сыпной тиф — вши, часть лихорадок — комары и клещи; то есть переносчиков тоже использовали как оружие. И про оспу: болезнь официально побеждена в 1980 году, но образцы вируса до сих пор лежат в двух лабораториях — в России и в США, — и это главная причина, по которой специалисты всерьёз говорят о риске утечки.</w:t>
       </w:r>
     </w:p>
     <w:p>
       <w:pPr>
-        <w:spacing w:before="160" w:after="40" w:line="264" w:lineRule="auto"/>
+        <w:spacing w:before="200" w:after="40" w:line="264" w:lineRule="auto"/>
       </w:pPr>
       <w:r>
         <w:rPr>
@@ -1247,12 +1263,12 @@
           <w:i w:val="0"/>
           <w:sz w:val="28"/>
         </w:rPr>
-        <w:t>Конвенция 1972 года запрещает биологическое оружие, в ней 189 государств. Но инспекций у неё нет — договор о проверках сорвался в 2001 году. А технологии — синтетическая биология и искусственный интеллект — делают создание новых микробов всё проще и дешевле.</w:t>
+        <w:t>Правовой режим. КБТО приняли в 1972 году, вступила в силу в 1975-м, участников 189 государств. Она запрещает разрабатывать, производить, накапливать и приобретать биологическое оружие. Но вот в чём её слабость, и это главное, что стоит запомнить: у КБТО нет механизма проверки, инспекторов у неё просто не существует. Протокол о проверках пытались принять, но переговоры сорвались в 2001 году; с 2023-го страны снова пытаются договориться, рабочая группа собирается до сих пор. Плюс новые угрозы: синтетическая биология и искусственный интеллект удешевляют создание новых микробов, а лабораторию двойного назначения — снаружи мирную, а внутри военную — отличить почти невозможно.</w:t>
       </w:r>
     </w:p>
     <w:p>
       <w:pPr>
-        <w:spacing w:before="160" w:after="40" w:line="264" w:lineRule="auto"/>
+        <w:spacing w:before="200" w:after="40" w:line="264" w:lineRule="auto"/>
       </w:pPr>
       <w:r>
         <w:rPr>
@@ -1287,12 +1303,12 @@
           <w:i w:val="0"/>
           <w:sz w:val="28"/>
         </w:rPr>
-        <w:t>В таблице самое главное. Химическое оружие: действует сразу, бьёт по одному району, не заразно, есть противоядия и работают инспекции. Биологическое: действует не сразу, заразно, может уйти в эпидемию, лечится в основном прививками, а контроля нет. По сути, химия — это управляемый удар, а биология — неуправляемый процесс.</w:t>
+        <w:t>И вот сравнительная таблица, она главная в докладе. Химическое оружие: это яды, действует сразу, в течение минут или часов; бьёт по району или городу; не заразно; заметить можно быстро — запах, туман, приборы; защита — противогаз и костюм; лечат противоядиями, причём быстро; конвенция есть и инспекции работают. Биологическое оружие: это живые микробы; действует через часы и недели; может охватить город, страну и континент; заразно; заметить почти невозможно; защита — прививки, гигиена, карантин; лечат антибиотиками и сыворотками, а вакцины нужны заранее; и главное — конвенция есть, а проверок нет. Если одним предложением: химия — это управляемый удар, а биология — неуправляемый процесс.</w:t>
       </w:r>
     </w:p>
     <w:p>
       <w:pPr>
-        <w:spacing w:before="160" w:after="40" w:line="264" w:lineRule="auto"/>
+        <w:spacing w:before="200" w:after="40" w:line="264" w:lineRule="auto"/>
       </w:pPr>
       <w:r>
         <w:rPr>
@@ -1327,12 +1343,12 @@
           <w:i w:val="0"/>
           <w:sz w:val="28"/>
         </w:rPr>
-        <w:t>Памятка. При химической угрозе: противогаз или влажная повязка, закрыть окна и двери, щели заклеить, не выходить без команды. При биологической: прививка, маска, мытьё рук, кипячёная вода. И нельзя трогать подозрительные пакеты, баллоны и посылки.</w:t>
+        <w:t>Памятка, самая практическая часть всего доклада. Если объявили химическую угрозу: противогаз или ватно-марлевая повязка, смоченная водой; закрыть окна и двери, щели заклеить плёнкой или влажной тканью; не выходить без команды и слушать оповещение. Если объявили эпидемию или биологическую угрозу: сделать прививку, если её предлагают; носить маску; мыть руки; пить только кипячёную или бутилированную воду; при симптомах идти к врачу, а не на учёбу или работу. И чего делать нельзя: трогать чужие пакеты, баллоны, посылки и жидкости; садиться на землю в зоне заражения; пить из колодцев и источников в зоне ЧС; и уходить куда глаза глядят вместо того, чтобы слушать указания спасателей.</w:t>
       </w:r>
     </w:p>
     <w:p>
       <w:pPr>
-        <w:spacing w:before="160" w:after="40" w:line="264" w:lineRule="auto"/>
+        <w:spacing w:before="200" w:after="40" w:line="264" w:lineRule="auto"/>
       </w:pPr>
       <w:r>
         <w:rPr>
@@ -1367,12 +1383,12 @@
           <w:i w:val="0"/>
           <w:sz w:val="28"/>
         </w:rPr>
-        <w:t>Шесть выводов. Химическое оружие — единственный вид ОМП, который человечеству удалось ликвидировать. У биологического оружия нет механизма проверки. Защита от обоих видов есть и она работает. Главный риск сегодня — технологии, а не арсеналы. А личная безопасность начинается с простых действий, которым можно научиться.</w:t>
+        <w:t>Выводы. Первое: химическое оружие — единственный вид ОМП, который человечеству удалось ликвидировать, уничтожено больше 72 тысяч тонн под международным контролем. Второе: биологическое оружие запрещено, но проверять некому — это главная дыра в системе безопасности. Третье: химия бьёт сразу и в одном месте, биология — скрытно и может уйти в эпидемию, поэтому её считают опаснее. Четвёртое: защита от обоих видов есть, и она реально работает. Пятое: главный риск сегодня — не склады государств, а технологии: лаборатории, синтетическая биология, искусственный интеллект. И шестое: личная безопасность начинается с простого — знать, где укрытие, уметь надеть повязку или противогаз и слушать оповещение.</w:t>
       </w:r>
     </w:p>
     <w:p>
       <w:pPr>
-        <w:spacing w:before="160" w:after="40" w:line="264" w:lineRule="auto"/>
+        <w:spacing w:before="200" w:after="40" w:line="264" w:lineRule="auto"/>
       </w:pPr>
       <w:r>
         <w:rPr>
@@ -1407,7 +1423,7 @@
           <w:i w:val="0"/>
           <w:sz w:val="28"/>
         </w:rPr>
-        <w:t>Источники: сайт ОЗХО, материалы ООН, тексты конвенций КЗХО и КБТО, материалы CDC и открытые исторические данные. Доклад закончен, я готов ответить на вопросы.</w:t>
+        <w:t>Источники: сайт ОЗХО, документы ООН, тексты конвенций КЗХО и КБТО, материалы американского центра по контролю заболеваний и открытые исторические данные. Все цифры актуальны на 2026 год; там, где оценки жертв расходятся, я давал диапазоны — так их и публикуют международные организации. На этом всё, спасибо за внимание, готов ответить на вопросы.</w:t>
       </w:r>
     </w:p>
     <w:p>
@@ -1423,7 +1439,7 @@
           <w:i/>
           <w:sz w:val="26"/>
         </w:rPr>
-        <w:t>Если останется время или спросят: «а что делать мне?» — отвечаем по слайду 32: противогаз или влажная повязка, укрыться, закрыть окна, слушать оповещение и не трогать подозрительные предметы.</w:t>
+        <w:t>Подсказка на случай вопроса «а что делать лично мне?» — отвечаем по слайду 32: противогаз или влажная повязка, укрыться, закрыть окна и двери, слушать оповещение, не трогать подозрительные предметы. Если спросят «какое оружие опаснее» — отвечаем по слайду 31: биологическое, потому что оно заразно, действует скрытно и может уйти в эпидемию, а ещё его почти некому проверять.</w:t>
       </w:r>
     </w:p>
     <w:sectPr>

</xml_diff>